<commit_message>
#Update Document of Spesifikasi Pekerjaan & Spesifikasi Pekerjaan Konsultansi Konstruksi RKST
</commit_message>
<xml_diff>
--- a/public/template/Spesifikasi Pekerjaan Konstruksi RKST - Template.docx
+++ b/public/template/Spesifikasi Pekerjaan Konstruksi RKST - Template.docx
@@ -2256,15 +2256,6 @@
         </w:rPr>
         <w:t>${nama_divisi}</w:t>
       </w:r>
-      <w:r>
-        <w:rPr>
-          <w:rFonts w:ascii="Arial" w:hAnsi="Arial" w:cs="Arial"/>
-          <w:b/>
-          <w:bCs/>
-          <w:color w:val="000000" w:themeColor="text1"/>
-        </w:rPr>
-        <w:t>.................................</w:t>
-      </w:r>
     </w:p>
     <w:p>
       <w:pPr>
@@ -2431,19 +2422,19 @@
   <w:p>
     <w:pPr>
       <w:pStyle w:val="Footer"/>
+      <w:ind w:left="-426" w:right="-115"/>
       <w:jc w:val="right"/>
+      <w:rPr>
+        <w:rFonts w:ascii="Arial" w:hAnsi="Arial" w:cs="Arial"/>
+        <w:lang w:val="en-US"/>
+      </w:rPr>
     </w:pPr>
     <w:r>
       <w:rPr>
         <w:rFonts w:ascii="Arial" w:hAnsi="Arial" w:cs="Arial"/>
-      </w:rPr>
-      <w:t xml:space="preserve">Spesifikasi Pekerjaan </w:t>
-    </w:r>
-    <w:r>
-      <w:rPr>
-        <w:rFonts w:ascii="Arial" w:hAnsi="Arial" w:cs="Arial"/>
-      </w:rPr>
-      <w:t>Konstruksi</w:t>
+        <w:lang w:val="en-US"/>
+      </w:rPr>
+      <w:t>${nama_spesifikasi_pekerjaan}</w:t>
     </w:r>
   </w:p>
 </w:ftr>

</xml_diff>